<commit_message>
Remove paper presets; data-driven defaults + tabular-only (KAN/MLP) models
Hyperparameters tuned on other cohorts are data-specific and don't transfer, so the UI no longer offers 'paper presets'. Settings now start from data-driven defaults (presets.defaults) derived from the uploaded data's size and covariate count, and auto-tune chooses the model.

This app ingests only tabular CSVs, so KAN-CNQ and MLP-CNQ are the only models offered and the only ones auto-tune searches (TABULAR_MODELS); transformers stay in APP_MODELS for backend/tests but are excluded from the UI and tuner. Updated server config/validation, front end (removed preset select + mode toggle, custom fields always shown, bumped ?v=12), tests, README/DEVELOPER, and MANUAL.docx.

Co-Authored-By: Claude Opus 4.8 <noreply@anthropic.com>
</commit_message>
<xml_diff>
--- a/cnq_app/MANUAL.docx
+++ b/cnq_app/MANUAL.docx
@@ -445,7 +445,7 @@
           <w:b w:val="0"/>
           <w:i w:val="0"/>
         </w:rPr>
-        <w:t>Choose settings (default): pick one or more models and their hyperparameters. 'Paper preset' reuses values tuned in the paper on a public dataset of similar size (the closest is marked 'suggested'); 'Custom' lets you set them yourself and is pre-filled from your data's size and covariate count.</w:t>
+        <w:t>Choose settings (default): pick a model (KAN-CNQ or MLP-CNQ) and its hyperparameters. The hyperparameter fields are pre-filled from your data's own size and covariate count — a sensible starting point you can edit. There are no 'paper presets': values tuned on other datasets are data-specific and don't transfer, so the app starts from your data instead. For pure tabular data, KAN and MLP are sufficient; transformer models (for text / annotation data) aren't offered, since this app ingests only tabular CSVs.</w:t>
       </w:r>
     </w:p>
     <w:p>
@@ -454,7 +454,7 @@
           <w:b w:val="0"/>
           <w:i w:val="0"/>
         </w:rPr>
-        <w:t>Auto-tune: let the app search several models and settings on your data and pick the best.</w:t>
+        <w:t>Auto-tune: let the app search several settings on your data and pick the best, including which of KAN-CNQ / MLP-CNQ to use.</w:t>
       </w:r>
     </w:p>
     <w:p>
@@ -462,7 +462,7 @@
         <w:pStyle w:val="ListNumber"/>
       </w:pPr>
       <w:r>
-        <w:t>Tick the model families to try — KAN-CNQ and MLP-CNQ by default. Transformers are opt-in and help only for nonstandard / cross-modality data.</w:t>
+        <w:t>Tick the model families to try — KAN-CNQ and MLP-CNQ, both on by default; the search picks between them.</w:t>
       </w:r>
     </w:p>
     <w:p>
@@ -486,7 +486,7 @@
         <w:pStyle w:val="ListNumber"/>
       </w:pPr>
       <w:r>
-        <w:t>Review the leaderboard (lower validation pinball is better), then click 'Use best settings' to fill in the winner. Review and Start training.</w:t>
+        <w:t>Review the leaderboard (lower validation pinball is better), then click 'Use best settings' to fill in the winning model and its hyperparameters. Review and Start training.</w:t>
       </w:r>
     </w:p>
     <w:p>

</xml_diff>

<commit_message>
Clarify saved model and data storage guidance
</commit_message>
<xml_diff>
--- a/cnq_app/MANUAL.docx
+++ b/cnq_app/MANUAL.docx
@@ -333,6 +333,24 @@
     </w:p>
     <w:p>
       <w:pPr>
+        <w:pStyle w:val="Heading2"/>
+      </w:pPr>
+      <w:r>
+        <w:t>2 1 Local storage and privacy</w:t>
+      </w:r>
+    </w:p>
+    <w:p>
+      <w:r>
+        <w:t>CNQ runs locally, but uploaded files are not temporary. Training, prediction, and cohort CSV files are copied to cnq_app/jobs/uploads. Recent run folders under cnq_app/jobs also contain reports, plots, predictions, model artifacts, and result zip files. A training result zip includes a copy of the uploaded data named input_data.csv.</w:t>
+      </w:r>
+    </w:p>
+    <w:p>
+      <w:r>
+        <w:t>CNQ keeps the 20 most recent run folders by default, but uploaded files are not removed automatically. Treat the CNQ folder as containing company data and follow your organization's retention and deletion procedures.</w:t>
+      </w:r>
+    </w:p>
+    <w:p>
+      <w:pPr>
         <w:pStyle w:val="Heading1"/>
         <w:pageBreakBefore/>
       </w:pPr>
@@ -464,12 +482,17 @@
         <w:t xml:space="preserve">6.  </w:t>
       </w:r>
       <w:r>
-        <w:t>Save a model. Final model refit on all data is usually the appropriate reusable model.</w:t>
+        <w:t>When training finishes, select Save model, choose what to save, enter a name, and save it.</w:t>
       </w:r>
     </w:p>
     <w:p>
       <w:r>
-        <w:t>A saved .cnqmodel file is self-contained. Download and archive any model that must be retained because CNQ keeps only a limited number of recent training runs.</w:t>
+        <w:t>Training and Auto-tune do not automatically create a reusable model. Save model writes a self-contained .cnqmodel file to cnq_app/models. It remains available after restarting CNQ and appears in Predict and Project. If it is not listed, select Refresh list.</w:t>
+      </w:r>
+    </w:p>
+    <w:p>
+      <w:r>
+        <w:t>Saved models are not pruned with old runs. Download and archive any approved model that must be retained outside the app folder.</w:t>
       </w:r>
     </w:p>
     <w:p>
@@ -494,6 +517,7 @@
       <w:tr>
         <w:trPr>
           <w:tblHeader w:val="true"/>
+          <w:cantSplit/>
         </w:trPr>
         <w:tc>
           <w:tcPr>
@@ -579,6 +603,9 @@
         </w:tc>
       </w:tr>
       <w:tr>
+        <w:trPr>
+          <w:cantSplit/>
+        </w:trPr>
         <w:tc>
           <w:tcPr>
             <w:tcW w:type="dxa" w:w="2952"/>
@@ -639,12 +666,15 @@
                 <w:rFonts w:ascii="Aptos" w:hAnsi="Aptos"/>
                 <w:sz w:val="20"/>
               </w:rPr>
-              <w:t>Standard option for numeric tabular covariates. Included in Auto-tune.</w:t>
+              <w:t>Standard numeric tabular option. Included in Auto-tune.</w:t>
             </w:r>
           </w:p>
         </w:tc>
       </w:tr>
       <w:tr>
+        <w:trPr>
+          <w:cantSplit/>
+        </w:trPr>
         <w:tc>
           <w:tcPr>
             <w:tcW w:type="dxa" w:w="2952"/>
@@ -707,12 +737,15 @@
                 <w:rFonts w:ascii="Aptos" w:hAnsi="Aptos"/>
                 <w:sz w:val="20"/>
               </w:rPr>
-              <w:t>Strong numeric tabular baseline. Included in Auto-tune.</w:t>
+              <w:t>Numeric tabular baseline. Included in Auto-tune.</w:t>
             </w:r>
           </w:p>
         </w:tc>
       </w:tr>
       <w:tr>
+        <w:trPr>
+          <w:cantSplit/>
+        </w:trPr>
         <w:tc>
           <w:tcPr>
             <w:tcW w:type="dxa" w:w="2952"/>
@@ -773,7 +806,7 @@
                 <w:rFonts w:ascii="Aptos" w:hAnsi="Aptos"/>
                 <w:sz w:val="20"/>
               </w:rPr>
-              <w:t>Advanced option only when approved numeric covariates contain information derived from text or structured annotations and attention is scientifically justified.</w:t>
+              <w:t>Advanced option for approved numeric features derived from text or annotations, when attention is scientifically justified.</w:t>
             </w:r>
           </w:p>
         </w:tc>
@@ -910,6 +943,7 @@
       <w:tr>
         <w:trPr>
           <w:tblHeader w:val="true"/>
+          <w:cantSplit/>
         </w:trPr>
         <w:tc>
           <w:tcPr>
@@ -995,6 +1029,9 @@
         </w:tc>
       </w:tr>
       <w:tr>
+        <w:trPr>
+          <w:cantSplit/>
+        </w:trPr>
         <w:tc>
           <w:tcPr>
             <w:tcW w:type="dxa" w:w="2880"/>
@@ -1061,6 +1098,9 @@
         </w:tc>
       </w:tr>
       <w:tr>
+        <w:trPr>
+          <w:cantSplit/>
+        </w:trPr>
         <w:tc>
           <w:tcPr>
             <w:tcW w:type="dxa" w:w="2880"/>
@@ -1306,6 +1346,7 @@
       <w:tr>
         <w:trPr>
           <w:tblHeader w:val="true"/>
+          <w:cantSplit/>
         </w:trPr>
         <w:tc>
           <w:tcPr>
@@ -1391,6 +1432,9 @@
         </w:tc>
       </w:tr>
       <w:tr>
+        <w:trPr>
+          <w:cantSplit/>
+        </w:trPr>
         <w:tc>
           <w:tcPr>
             <w:tcW w:type="dxa" w:w="3096"/>
@@ -1457,6 +1501,9 @@
         </w:tc>
       </w:tr>
       <w:tr>
+        <w:trPr>
+          <w:cantSplit/>
+        </w:trPr>
         <w:tc>
           <w:tcPr>
             <w:tcW w:type="dxa" w:w="3096"/>
@@ -1525,6 +1572,9 @@
         </w:tc>
       </w:tr>
       <w:tr>
+        <w:trPr>
+          <w:cantSplit/>
+        </w:trPr>
         <w:tc>
           <w:tcPr>
             <w:tcW w:type="dxa" w:w="3096"/>
@@ -1591,6 +1641,9 @@
         </w:tc>
       </w:tr>
       <w:tr>
+        <w:trPr>
+          <w:cantSplit/>
+        </w:trPr>
         <w:tc>
           <w:tcPr>
             <w:tcW w:type="dxa" w:w="3096"/>
@@ -1659,6 +1712,9 @@
         </w:tc>
       </w:tr>
       <w:tr>
+        <w:trPr>
+          <w:cantSplit/>
+        </w:trPr>
         <w:tc>
           <w:tcPr>
             <w:tcW w:type="dxa" w:w="3096"/>

</xml_diff>